<commit_message>
Wiceprezes, tytuł opiekuna, pytania do Sekcji Wsparcia Organizacji Studenckich
Jakub Maryniak jako proponowany Wiceprezes (zgoda potwierdzona); dr hab. inż. Tomasz Kajdanowicz, prof. uczelni, w dokumentach do podpisu; dokumenty/pytania-do-swos.md; DOCX wygenerowane ponownie.

Co-Authored-By: Claude Opus 5.5 <noreply@anthropic.com>
</commit_message>
<xml_diff>
--- a/kolo-naukowe/dokumenty/do-druku/protokol-zebrania-zalozycielskiego.docx
+++ b/kolo-naukowe/dokumenty/do-druku/protokol-zebrania-zalozycielskiego.docx
@@ -404,7 +404,7 @@
           <w:p>
             <w:r/>
             <w:r>
-              <w:t>………………………</w:t>
+              <w:t>Jakub Maryniak; ……………</w:t>
             </w:r>
           </w:p>
         </w:tc>
@@ -522,7 +522,7 @@
         <w:t>Uchwała nr 4/…</w:t>
       </w:r>
       <w:r>
-        <w:t xml:space="preserve"> w sprawie wniosku o powołanie opiekunów naukowych Zebranie wnosi o powołanie na opiekunów naukowych Koła: dr. hab. inż. Tomasza Kajdanowicza oraz dr. hab. inż. Jarosława Szreka, prof. uczelni. Głosowanie jawne: za ……, przeciw ……, wstrzymało się ……</w:t>
+        <w:t xml:space="preserve"> w sprawie wniosku o powołanie opiekunów naukowych Zebranie wnosi o powołanie na opiekunów naukowych Koła: dr. hab. inż. Tomasza Kajdanowicza, prof. uczelni, oraz dr. hab. inż. Jarosława Szreka, prof. uczelni. Głosowanie jawne: za ……, przeciw ……, wstrzymało się ……</w:t>
       </w:r>
     </w:p>
     <w:p>

</xml_diff>

<commit_message>
Regulamin uproszczony: 10 paragrafów zamiast 17
- statut.md: układ bliski szablonowi PWr; zostały wymagane elementy,
  cele (physical AI, badania, przedsiębiorczość), koło międzywydziałowe
  i siedziba, sekcje, trzyosobowy Zarząd, dwóch opiekunów, startupy poza
  kołem, wykluczenie po upomnieniu z odwołaniem. Wypadły rozbudowane
  procedury (przegląd aktywności, kontrola Zarządu, plan i limit
  kadencji, kategorie członków nowych i aktywnych).
- decyzje.md: wpis o uproszczeniu; odwołania w protokole, pytaniach do
  Sekcji i programie poprawione; review oznaczone jako dotyczące starszej
  wersji; regulamin.docx wygenerowany ponownie.

Co-Authored-By: Claude Opus 5.5 <noreply@anthropic.com>
</commit_message>
<xml_diff>
--- a/kolo-naukowe/dokumenty/do-druku/protokol-zebrania-zalozycielskiego.docx
+++ b/kolo-naukowe/dokumenty/do-druku/protokol-zebrania-zalozycielskiego.docx
@@ -220,7 +220,7 @@
         <w:t>Uchwała nr 3/…</w:t>
       </w:r>
       <w:r>
-        <w:t xml:space="preserve"> w sprawie wyboru Zarządu Wybory przeprowadzono w głosowaniu tajnym, osobno na każdą funkcję, zgodnie z § 9 ust. 9 regulaminu. Komisja skrutacyjna: ……………………………</w:t>
+        <w:t xml:space="preserve"> w sprawie wyboru Zarządu Wybory przeprowadzono w głosowaniu tajnym, osobno na każdą funkcję, zgodnie z § 7 ust. 1 regulaminu. Komisja skrutacyjna: ……………………………</w:t>
       </w:r>
     </w:p>
     <w:tbl>
@@ -507,7 +507,7 @@
         <w:ind w:left="0"/>
       </w:pPr>
       <w:r>
-        <w:t>Kadencja pierwszego Zarządu trwa do końca roku akademickiego, w którym Koło zostanie zarejestrowane (§ 9 ust. 8 regulaminu).</w:t>
+        <w:t>Kadencja pierwszego Zarządu obejmuje bieżący rok akademicki (§ 7 ust. 1 i § 10 ust. 4 regulaminu).</w:t>
       </w:r>
     </w:p>
     <w:p>

</xml_diff>

<commit_message>
Regulamin zrównany z szablonem PWr (§ 1–9)
- statut.md: układ i brzmienie szablonu regulaminu UOS PWr: § 1
  Postanowienia ogólne, § 2 Cele i zadania, § 3, § 4 Źródła
  finansowania, § 5 Członkostwo, § 6 Struktura organizacyjna, § 7, § 8,
  § 9 Postanowienia końcowe; miejsca do uzupełnienia wypełnione danymi
  koła, dodatki: koło międzywydziałowe, dwóch opiekunów, sekcje,
  startupy, licencja, BHP.
- decyzje.md: wpis o zrównaniu i zmienionych wartościach; odwołania
  w protokole, pytaniach do Sekcji i programie poprawione; DOCX
  wygenerowane ponownie.

Co-Authored-By: Claude Opus 5.5 <noreply@anthropic.com>
</commit_message>
<xml_diff>
--- a/kolo-naukowe/dokumenty/do-druku/protokol-zebrania-zalozycielskiego.docx
+++ b/kolo-naukowe/dokumenty/do-druku/protokol-zebrania-zalozycielskiego.docx
@@ -220,7 +220,7 @@
         <w:t>Uchwała nr 3/…</w:t>
       </w:r>
       <w:r>
-        <w:t xml:space="preserve"> w sprawie wyboru Zarządu Wybory przeprowadzono w głosowaniu tajnym, osobno na każdą funkcję, zgodnie z § 7 ust. 1 regulaminu. Komisja skrutacyjna: ……………………………</w:t>
+        <w:t xml:space="preserve"> w sprawie wyboru Zarządu Wybory przeprowadzono w głosowaniu tajnym, osobno na każdą funkcję, zgodnie z § 7 ust. 2 pkt 2.1 regulaminu. Komisja skrutacyjna: ……………………………</w:t>
       </w:r>
     </w:p>
     <w:tbl>
@@ -507,7 +507,7 @@
         <w:ind w:left="0"/>
       </w:pPr>
       <w:r>
-        <w:t>Kadencja pierwszego Zarządu obejmuje bieżący rok akademicki (§ 7 ust. 1 i § 10 ust. 4 regulaminu).</w:t>
+        <w:t>Kadencja pierwszego Zarządu obejmuje bieżący rok akademicki (§ 7 ust. 2 pkt 2.1 i § 9 ust. 6 regulaminu).</w:t>
       </w:r>
     </w:p>
     <w:p>

</xml_diff>

<commit_message>
Regulamin bez Walnego Zgromadzenia: władzą jest Zarząd
- statut.md: usunięte Walne Zgromadzenie i głosowania członków (§ 1–8);
  pierwszy Zarząd wybierają założyciele, kolejny powołuje ustępujący
  Zarząd za zgodą opiekunów; opiekunowie odwołują członków Zarządu
  i rozstrzygają odwołania od wykluczenia; zmiana regulaminu
  i rozwiązanie: jednomyślna uchwała Zarządu za zgodą opiekunów.
- decyzje.md, protokół, pytania do Sekcji (nowe pytanie o
  dopuszczalność); DOCX wygenerowane ponownie.

Co-Authored-By: Claude Opus 5.5 <noreply@anthropic.com>
</commit_message>
<xml_diff>
--- a/kolo-naukowe/dokumenty/do-druku/protokol-zebrania-zalozycielskiego.docx
+++ b/kolo-naukowe/dokumenty/do-druku/protokol-zebrania-zalozycielskiego.docx
@@ -220,7 +220,7 @@
         <w:t>Uchwała nr 3/…</w:t>
       </w:r>
       <w:r>
-        <w:t xml:space="preserve"> w sprawie wyboru Zarządu Wybory przeprowadzono w głosowaniu tajnym, osobno na każdą funkcję, zgodnie z § 7 ust. 2 pkt 2.1 regulaminu. Komisja skrutacyjna: ……………………………</w:t>
+        <w:t xml:space="preserve"> w sprawie wyboru Zarządu Wybory przeprowadzono w głosowaniu tajnym, osobno na każdą funkcję, zgodnie z § 7 ust. 2 pkt 2.2 regulaminu. Komisja skrutacyjna: ……………………………</w:t>
       </w:r>
     </w:p>
     <w:tbl>
@@ -507,7 +507,7 @@
         <w:ind w:left="0"/>
       </w:pPr>
       <w:r>
-        <w:t>Kadencja pierwszego Zarządu obejmuje bieżący rok akademicki (§ 7 ust. 2 pkt 2.1 i § 9 ust. 6 regulaminu).</w:t>
+        <w:t>Kadencja pierwszego Zarządu obejmuje bieżący rok akademicki (§ 7 ust. 2 pkt 2.1–2.2 regulaminu).</w:t>
       </w:r>
     </w:p>
     <w:p>

</xml_diff>